<commit_message>
Refine Flutter developer CV
</commit_message>
<xml_diff>
--- a/CV/CV_RizkaFajarNugraha_FlutterDeveloper_2026.docx
+++ b/CV/CV_RizkaFajarNugraha_FlutterDeveloper_2026.docx
@@ -178,109 +178,85 @@
           <w:color w:val="222222"/>
           <w:b/>
         </w:rPr>
-        <w:t>TECHNICAL EXPERTISE</w:t>
-      </w:r>
-    </w:p>
-    <w:p>
-      <w:pPr>
-        <w:numPr>
-          <w:ilvl w:val="0"/>
-          <w:numId w:val="1"/>
-        </w:numPr>
-        <w:spacing w:after="48" w:line="276" w:lineRule="auto"/>
-      </w:pPr>
-      <w:r>
-        <w:rPr>
-          <w:rFonts w:ascii="Arial" w:hAnsi="Arial"/>
-          <w:sz w:val="21"/>
-          <w:color w:val="222222"/>
-        </w:rPr>
-        <w:t>Flutter &amp; Dart: BLoC, Cubit, Provider/MVVM, GoRouter, Dio, GetIt, Dartz/Either, Equatable, async/await, isolates/compute(), MethodChannel, Dart FFI.</w:t>
-      </w:r>
-    </w:p>
-    <w:p>
-      <w:pPr>
-        <w:numPr>
-          <w:ilvl w:val="0"/>
-          <w:numId w:val="1"/>
-        </w:numPr>
-        <w:spacing w:after="48" w:line="276" w:lineRule="auto"/>
-      </w:pPr>
-      <w:r>
-        <w:rPr>
-          <w:rFonts w:ascii="Arial" w:hAnsi="Arial"/>
-          <w:sz w:val="21"/>
-          <w:color w:val="222222"/>
-        </w:rPr>
-        <w:t>Mobile App Architecture: Clean Architecture, MVVM, repository pattern, dependency injection, feature modules, domain/data/presentation separation, offline-first strategy.</w:t>
-      </w:r>
-    </w:p>
-    <w:p>
-      <w:pPr>
-        <w:numPr>
-          <w:ilvl w:val="0"/>
-          <w:numId w:val="1"/>
-        </w:numPr>
-        <w:spacing w:after="48" w:line="276" w:lineRule="auto"/>
-      </w:pPr>
-      <w:r>
-        <w:rPr>
-          <w:rFonts w:ascii="Arial" w:hAnsi="Arial"/>
-          <w:sz w:val="21"/>
-          <w:color w:val="222222"/>
-        </w:rPr>
-        <w:t>Production Mobile Features: authentication, JWT token refresh, Firebase Auth, Google Sign-In, FCM, maps/location, geofence, liveness flows, pagination, search debounce, bookmarks, profile/avatar upload.</w:t>
-      </w:r>
-    </w:p>
-    <w:p>
-      <w:pPr>
-        <w:numPr>
-          <w:ilvl w:val="0"/>
-          <w:numId w:val="1"/>
-        </w:numPr>
-        <w:spacing w:after="48" w:line="276" w:lineRule="auto"/>
-      </w:pPr>
-      <w:r>
-        <w:rPr>
-          <w:rFonts w:ascii="Arial" w:hAnsi="Arial"/>
-          <w:sz w:val="21"/>
-          <w:color w:val="222222"/>
-        </w:rPr>
-        <w:t>Local Storage &amp; Networking: FlutterSecureStorage, SharedPreferences, REST API integration, interceptors, error mapping, graceful cache fallback, image/network caching.</w:t>
-      </w:r>
-    </w:p>
-    <w:p>
-      <w:pPr>
-        <w:numPr>
-          <w:ilvl w:val="0"/>
-          <w:numId w:val="1"/>
-        </w:numPr>
-        <w:spacing w:after="48" w:line="276" w:lineRule="auto"/>
-      </w:pPr>
-      <w:r>
-        <w:rPr>
-          <w:rFonts w:ascii="Arial" w:hAnsi="Arial"/>
-          <w:sz w:val="21"/>
-          <w:color w:val="222222"/>
-        </w:rPr>
-        <w:t>Testing &amp; Tooling: unit tests, bloc_test, mocktail, http_mock_adapter, debug flavors, Chucker, multi-flavor builds, CI/CD awareness, code review standards.</w:t>
-      </w:r>
-    </w:p>
-    <w:p>
-      <w:pPr>
-        <w:numPr>
-          <w:ilvl w:val="0"/>
-          <w:numId w:val="1"/>
-        </w:numPr>
-        <w:spacing w:after="48" w:line="276" w:lineRule="auto"/>
-      </w:pPr>
-      <w:r>
-        <w:rPr>
-          <w:rFonts w:ascii="Arial" w:hAnsi="Arial"/>
-          <w:sz w:val="21"/>
-          <w:color w:val="222222"/>
-        </w:rPr>
-        <w:t>Native Support: Swift, SwiftUI, UIKit, Kotlin, Android SDK, CameraX, ML Kit, Apple Vision, VisionKit, URLSession, SQLite, CocoaPods, Gradle.</w:t>
+        <w:t>FLUTTER ROLE FIT</w:t>
+      </w:r>
+    </w:p>
+    <w:p>
+      <w:pPr>
+        <w:numPr>
+          <w:ilvl w:val="0"/>
+          <w:numId w:val="1"/>
+        </w:numPr>
+        <w:spacing w:after="48" w:line="276" w:lineRule="auto"/>
+      </w:pPr>
+      <w:r>
+        <w:rPr>
+          <w:rFonts w:ascii="Arial" w:hAnsi="Arial"/>
+          <w:sz w:val="22"/>
+          <w:color w:val="222222"/>
+          <w:b/>
+        </w:rPr>
+        <w:t xml:space="preserve">Production Flutter delivery: </w:t>
+      </w:r>
+      <w:r>
+        <w:rPr>
+          <w:rFonts w:ascii="Arial" w:hAnsi="Arial"/>
+          <w:sz w:val="22"/>
+          <w:color w:val="222222"/>
+        </w:rPr>
+        <w:t>Experience spans confidential company/client apps and public portfolio projects, with case studies linked for deeper review.</w:t>
+      </w:r>
+    </w:p>
+    <w:p>
+      <w:pPr>
+        <w:numPr>
+          <w:ilvl w:val="0"/>
+          <w:numId w:val="1"/>
+        </w:numPr>
+        <w:spacing w:after="48" w:line="276" w:lineRule="auto"/>
+      </w:pPr>
+      <w:r>
+        <w:rPr>
+          <w:rFonts w:ascii="Arial" w:hAnsi="Arial"/>
+          <w:sz w:val="22"/>
+          <w:color w:val="222222"/>
+          <w:b/>
+        </w:rPr>
+        <w:t xml:space="preserve">Architecture and maintainability: </w:t>
+      </w:r>
+      <w:r>
+        <w:rPr>
+          <w:rFonts w:ascii="Arial" w:hAnsi="Arial"/>
+          <w:sz w:val="22"/>
+          <w:color w:val="222222"/>
+        </w:rPr>
+        <w:t>Comfortable with BLoC/Cubit, Clean Architecture, repository pattern, dependency injection, typed error handling, route guards, and modular feature boundaries.</w:t>
+      </w:r>
+    </w:p>
+    <w:p>
+      <w:pPr>
+        <w:numPr>
+          <w:ilvl w:val="0"/>
+          <w:numId w:val="1"/>
+        </w:numPr>
+        <w:spacing w:after="48" w:line="276" w:lineRule="auto"/>
+      </w:pPr>
+      <w:r>
+        <w:rPr>
+          <w:rFonts w:ascii="Arial" w:hAnsi="Arial"/>
+          <w:sz w:val="22"/>
+          <w:color w:val="222222"/>
+          <w:b/>
+        </w:rPr>
+        <w:t xml:space="preserve">Native and performance depth: </w:t>
+      </w:r>
+      <w:r>
+        <w:rPr>
+          <w:rFonts w:ascii="Arial" w:hAnsi="Arial"/>
+          <w:sz w:val="22"/>
+          <w:color w:val="222222"/>
+        </w:rPr>
+        <w:t>Native Swift/Kotlin background supports MethodChannel, Dart FFI, CameraX/ML Kit, Apple Vision, isolates, and platform-level debugging when Flutter needs more than UI code.</w:t>
       </w:r>
     </w:p>
     <w:p>
@@ -295,189 +271,109 @@
           <w:color w:val="222222"/>
           <w:b/>
         </w:rPr>
-        <w:t>WORK EXPERIENCE</w:t>
-      </w:r>
-    </w:p>
-    <w:p>
-      <w:pPr>
-        <w:spacing w:before="85" w:after="30" w:line="276" w:lineRule="auto"/>
-      </w:pPr>
-      <w:r>
-        <w:rPr>
-          <w:rFonts w:ascii="Arial" w:hAnsi="Arial"/>
-          <w:sz w:val="23"/>
-          <w:color w:val="222222"/>
-          <w:b/>
-        </w:rPr>
-        <w:t>Chapter Lead Mobile Developer</w:t>
-      </w:r>
-      <w:r>
-        <w:rPr>
-          <w:rFonts w:ascii="Arial" w:hAnsi="Arial"/>
-          <w:sz w:val="22"/>
-          <w:color w:val="222222"/>
-          <w:b/>
-        </w:rPr>
-        <w:t> | Komerce - Purbalingga | Nov 2021 - Present</w:t>
-      </w:r>
-    </w:p>
-    <w:p>
-      <w:pPr>
-        <w:numPr>
-          <w:ilvl w:val="0"/>
-          <w:numId w:val="1"/>
-        </w:numPr>
-        <w:spacing w:after="48" w:line="276" w:lineRule="auto"/>
-      </w:pPr>
-      <w:r>
-        <w:rPr>
-          <w:rFonts w:ascii="Arial" w:hAnsi="Arial"/>
-          <w:sz w:val="21"/>
-          <w:color w:val="222222"/>
-        </w:rPr>
-        <w:t>Led mobile engineering standards across iOS and Android teams, including code review quality, architecture consistency, delivery workflows, and mentoring.</w:t>
-      </w:r>
-    </w:p>
-    <w:p>
-      <w:pPr>
-        <w:numPr>
-          <w:ilvl w:val="0"/>
-          <w:numId w:val="1"/>
-        </w:numPr>
-        <w:spacing w:after="48" w:line="276" w:lineRule="auto"/>
-      </w:pPr>
-      <w:r>
-        <w:rPr>
-          <w:rFonts w:ascii="Arial" w:hAnsi="Arial"/>
-          <w:sz w:val="21"/>
-          <w:color w:val="222222"/>
-        </w:rPr>
-        <w:t>Contributed to production mobile applications across logistics, shipping, seller operations, HRIS, workforce management, and partner/talent operations.</w:t>
-      </w:r>
-    </w:p>
-    <w:p>
-      <w:pPr>
-        <w:numPr>
-          <w:ilvl w:val="0"/>
-          <w:numId w:val="1"/>
-        </w:numPr>
-        <w:spacing w:after="48" w:line="276" w:lineRule="auto"/>
-      </w:pPr>
-      <w:r>
-        <w:rPr>
-          <w:rFonts w:ascii="Arial" w:hAnsi="Arial"/>
-          <w:sz w:val="21"/>
-          <w:color w:val="222222"/>
-        </w:rPr>
-        <w:t>Established practical architecture habits around MVVM, repository pattern, modular boundaries, API integration, and maintainable feature delivery.</w:t>
-      </w:r>
-    </w:p>
-    <w:p>
-      <w:pPr>
-        <w:numPr>
-          <w:ilvl w:val="0"/>
-          <w:numId w:val="1"/>
-        </w:numPr>
-        <w:spacing w:after="48" w:line="276" w:lineRule="auto"/>
-      </w:pPr>
-      <w:r>
-        <w:rPr>
-          <w:rFonts w:ascii="Arial" w:hAnsi="Arial"/>
-          <w:sz w:val="21"/>
-          <w:color w:val="222222"/>
-        </w:rPr>
-        <w:t>Worked close to product and operations teams, translating business workflows into mobile experiences that could be used daily by internal teams, partners, sellers, and field users.</w:t>
-      </w:r>
-    </w:p>
-    <w:p>
-      <w:pPr>
-        <w:numPr>
-          <w:ilvl w:val="0"/>
-          <w:numId w:val="1"/>
-        </w:numPr>
-        <w:spacing w:after="48" w:line="276" w:lineRule="auto"/>
-      </w:pPr>
-      <w:r>
-        <w:rPr>
-          <w:rFonts w:ascii="Arial" w:hAnsi="Arial"/>
-          <w:sz w:val="21"/>
-          <w:color w:val="222222"/>
-        </w:rPr>
-        <w:t>Maintained native iOS and Android delivery capability while shifting current focus toward Flutter production roles.</w:t>
-      </w:r>
-    </w:p>
-    <w:p>
-      <w:pPr>
-        <w:spacing w:before="85" w:after="30" w:line="276" w:lineRule="auto"/>
-      </w:pPr>
-      <w:r>
-        <w:rPr>
-          <w:rFonts w:ascii="Arial" w:hAnsi="Arial"/>
-          <w:sz w:val="23"/>
-          <w:color w:val="222222"/>
-          <w:b/>
-        </w:rPr>
-        <w:t>Flutter Developer</w:t>
-      </w:r>
-      <w:r>
-        <w:rPr>
-          <w:rFonts w:ascii="Arial" w:hAnsi="Arial"/>
-          <w:sz w:val="22"/>
-          <w:color w:val="222222"/>
-          <w:b/>
-        </w:rPr>
-        <w:t> | Production / Client Projects | 2024 - 2026</w:t>
-      </w:r>
-    </w:p>
-    <w:p>
-      <w:pPr>
-        <w:numPr>
-          <w:ilvl w:val="0"/>
-          <w:numId w:val="1"/>
-        </w:numPr>
-        <w:spacing w:after="48" w:line="276" w:lineRule="auto"/>
-      </w:pPr>
-      <w:r>
-        <w:rPr>
-          <w:rFonts w:ascii="Arial" w:hAnsi="Arial"/>
-          <w:sz w:val="21"/>
-          <w:color w:val="222222"/>
-        </w:rPr>
-        <w:t>Built and contributed to Flutter applications for HRIS, workforce management, government aid workflows, livestock monitoring, and partner operations.</w:t>
-      </w:r>
-    </w:p>
-    <w:p>
-      <w:pPr>
-        <w:numPr>
-          <w:ilvl w:val="0"/>
-          <w:numId w:val="1"/>
-        </w:numPr>
-        <w:spacing w:after="48" w:line="276" w:lineRule="auto"/>
-      </w:pPr>
-      <w:r>
-        <w:rPr>
-          <w:rFonts w:ascii="Arial" w:hAnsi="Arial"/>
-          <w:sz w:val="21"/>
-          <w:color w:val="222222"/>
-        </w:rPr>
-        <w:t>Implemented common production mobile patterns: authenticated API calls, role-based flows, maps/geolocation, liveness/attendance, offline/local cache, push notifications, loading/error states, and multi-flavor environments.</w:t>
-      </w:r>
-    </w:p>
-    <w:p>
-      <w:pPr>
-        <w:numPr>
-          <w:ilvl w:val="0"/>
-          <w:numId w:val="1"/>
-        </w:numPr>
-        <w:spacing w:after="48" w:line="276" w:lineRule="auto"/>
-      </w:pPr>
-      <w:r>
-        <w:rPr>
-          <w:rFonts w:ascii="Arial" w:hAnsi="Arial"/>
-          <w:sz w:val="21"/>
-          <w:color w:val="222222"/>
-        </w:rPr>
-        <w:t>Used Flutter BLoC/Cubit, GoRouter, Dio, GetIt, SharedPreferences, Firebase services, maps packages, WebView, charts, skeleton loading, and debugging tools across real app contexts.</w:t>
+        <w:t>TECHNICAL EXPERTISE</w:t>
+      </w:r>
+    </w:p>
+    <w:p>
+      <w:pPr>
+        <w:numPr>
+          <w:ilvl w:val="0"/>
+          <w:numId w:val="1"/>
+        </w:numPr>
+        <w:spacing w:after="48" w:line="276" w:lineRule="auto"/>
+      </w:pPr>
+      <w:r>
+        <w:rPr>
+          <w:rFonts w:ascii="Arial" w:hAnsi="Arial"/>
+          <w:sz w:val="21"/>
+          <w:color w:val="222222"/>
+        </w:rPr>
+        <w:t>Flutter &amp; Dart: BLoC, Cubit, Provider/MVVM, GoRouter, Dio, GetIt, Dartz/Either, Equatable, async/await, isolates/compute(), MethodChannel, Dart FFI.</w:t>
+      </w:r>
+    </w:p>
+    <w:p>
+      <w:pPr>
+        <w:numPr>
+          <w:ilvl w:val="0"/>
+          <w:numId w:val="1"/>
+        </w:numPr>
+        <w:spacing w:after="48" w:line="276" w:lineRule="auto"/>
+      </w:pPr>
+      <w:r>
+        <w:rPr>
+          <w:rFonts w:ascii="Arial" w:hAnsi="Arial"/>
+          <w:sz w:val="21"/>
+          <w:color w:val="222222"/>
+        </w:rPr>
+        <w:t>Mobile App Architecture: Clean Architecture, MVVM, repository pattern, dependency injection, feature modules, domain/data/presentation separation, offline-first strategy.</w:t>
+      </w:r>
+    </w:p>
+    <w:p>
+      <w:pPr>
+        <w:numPr>
+          <w:ilvl w:val="0"/>
+          <w:numId w:val="1"/>
+        </w:numPr>
+        <w:spacing w:after="48" w:line="276" w:lineRule="auto"/>
+      </w:pPr>
+      <w:r>
+        <w:rPr>
+          <w:rFonts w:ascii="Arial" w:hAnsi="Arial"/>
+          <w:sz w:val="21"/>
+          <w:color w:val="222222"/>
+        </w:rPr>
+        <w:t>Production Mobile Features: authentication, JWT token refresh, Firebase Auth, Google Sign-In, FCM, maps/location, geofence, liveness flows, pagination, search debounce, bookmarks, profile/avatar upload.</w:t>
+      </w:r>
+    </w:p>
+    <w:p>
+      <w:pPr>
+        <w:numPr>
+          <w:ilvl w:val="0"/>
+          <w:numId w:val="1"/>
+        </w:numPr>
+        <w:spacing w:after="48" w:line="276" w:lineRule="auto"/>
+      </w:pPr>
+      <w:r>
+        <w:rPr>
+          <w:rFonts w:ascii="Arial" w:hAnsi="Arial"/>
+          <w:sz w:val="21"/>
+          <w:color w:val="222222"/>
+        </w:rPr>
+        <w:t>Local Storage &amp; Networking: FlutterSecureStorage, SharedPreferences, REST API integration, interceptors, error mapping, graceful cache fallback, image/network caching.</w:t>
+      </w:r>
+    </w:p>
+    <w:p>
+      <w:pPr>
+        <w:numPr>
+          <w:ilvl w:val="0"/>
+          <w:numId w:val="1"/>
+        </w:numPr>
+        <w:spacing w:after="48" w:line="276" w:lineRule="auto"/>
+      </w:pPr>
+      <w:r>
+        <w:rPr>
+          <w:rFonts w:ascii="Arial" w:hAnsi="Arial"/>
+          <w:sz w:val="22"/>
+          <w:color w:val="222222"/>
+        </w:rPr>
+        <w:t>Testing &amp; Tooling: unit tests, bloc_test, mocktail, http_mock_adapter, debug flavors, Chucker, multi-flavor builds, Flutter analyzer/lints, CI/CD awareness, code review standards.</w:t>
+      </w:r>
+    </w:p>
+    <w:p>
+      <w:pPr>
+        <w:numPr>
+          <w:ilvl w:val="0"/>
+          <w:numId w:val="1"/>
+        </w:numPr>
+        <w:spacing w:after="48" w:line="276" w:lineRule="auto"/>
+      </w:pPr>
+      <w:r>
+        <w:rPr>
+          <w:rFonts w:ascii="Arial" w:hAnsi="Arial"/>
+          <w:sz w:val="22"/>
+          <w:color w:val="222222"/>
+        </w:rPr>
+        <w:t>Native Support: Swift, SwiftUI, UIKit, Kotlin, Android SDK, CameraX, ML Kit, Apple Vision, VisionKit, URLSession, SQLite, CocoaPods, Gradle, Xcode, Android Studio.</w:t>
       </w:r>
     </w:p>
     <w:p>
@@ -492,6 +388,203 @@
           <w:color w:val="222222"/>
           <w:b/>
         </w:rPr>
+        <w:t>WORK EXPERIENCE</w:t>
+      </w:r>
+    </w:p>
+    <w:p>
+      <w:pPr>
+        <w:spacing w:before="85" w:after="30" w:line="276" w:lineRule="auto"/>
+      </w:pPr>
+      <w:r>
+        <w:rPr>
+          <w:rFonts w:ascii="Arial" w:hAnsi="Arial"/>
+          <w:sz w:val="23"/>
+          <w:color w:val="222222"/>
+          <w:b/>
+        </w:rPr>
+        <w:t>Chapter Lead Mobile Developer</w:t>
+      </w:r>
+      <w:r>
+        <w:rPr>
+          <w:rFonts w:ascii="Arial" w:hAnsi="Arial"/>
+          <w:sz w:val="22"/>
+          <w:color w:val="222222"/>
+          <w:b/>
+        </w:rPr>
+        <w:t> | Komerce - Purbalingga | Nov 2021 - Present</w:t>
+      </w:r>
+    </w:p>
+    <w:p>
+      <w:pPr>
+        <w:numPr>
+          <w:ilvl w:val="0"/>
+          <w:numId w:val="1"/>
+        </w:numPr>
+        <w:spacing w:after="48" w:line="276" w:lineRule="auto"/>
+      </w:pPr>
+      <w:r>
+        <w:rPr>
+          <w:rFonts w:ascii="Arial" w:hAnsi="Arial"/>
+          <w:sz w:val="21"/>
+          <w:color w:val="222222"/>
+        </w:rPr>
+        <w:t>Led mobile engineering standards across iOS and Android teams, including code review quality, architecture consistency, delivery workflows, and mentoring.</w:t>
+      </w:r>
+    </w:p>
+    <w:p>
+      <w:pPr>
+        <w:numPr>
+          <w:ilvl w:val="0"/>
+          <w:numId w:val="1"/>
+        </w:numPr>
+        <w:spacing w:after="48" w:line="276" w:lineRule="auto"/>
+      </w:pPr>
+      <w:r>
+        <w:rPr>
+          <w:rFonts w:ascii="Arial" w:hAnsi="Arial"/>
+          <w:sz w:val="21"/>
+          <w:color w:val="222222"/>
+        </w:rPr>
+        <w:t>Contributed to production mobile applications across logistics, shipping, seller operations, HRIS, workforce management, and partner/talent operations.</w:t>
+      </w:r>
+    </w:p>
+    <w:p>
+      <w:pPr>
+        <w:numPr>
+          <w:ilvl w:val="0"/>
+          <w:numId w:val="1"/>
+        </w:numPr>
+        <w:spacing w:after="48" w:line="276" w:lineRule="auto"/>
+      </w:pPr>
+      <w:r>
+        <w:rPr>
+          <w:rFonts w:ascii="Arial" w:hAnsi="Arial"/>
+          <w:sz w:val="21"/>
+          <w:color w:val="222222"/>
+        </w:rPr>
+        <w:t>Established practical architecture habits around MVVM, repository pattern, modular boundaries, API integration, and maintainable feature delivery.</w:t>
+      </w:r>
+    </w:p>
+    <w:p>
+      <w:pPr>
+        <w:numPr>
+          <w:ilvl w:val="0"/>
+          <w:numId w:val="1"/>
+        </w:numPr>
+        <w:spacing w:after="48" w:line="276" w:lineRule="auto"/>
+      </w:pPr>
+      <w:r>
+        <w:rPr>
+          <w:rFonts w:ascii="Arial" w:hAnsi="Arial"/>
+          <w:sz w:val="21"/>
+          <w:color w:val="222222"/>
+        </w:rPr>
+        <w:t>Worked close to product and operations teams, translating business workflows into mobile experiences that could be used daily by internal teams, partners, sellers, and field users.</w:t>
+      </w:r>
+    </w:p>
+    <w:p>
+      <w:pPr>
+        <w:numPr>
+          <w:ilvl w:val="0"/>
+          <w:numId w:val="1"/>
+        </w:numPr>
+        <w:spacing w:after="48" w:line="276" w:lineRule="auto"/>
+      </w:pPr>
+      <w:r>
+        <w:rPr>
+          <w:rFonts w:ascii="Arial" w:hAnsi="Arial"/>
+          <w:sz w:val="21"/>
+          <w:color w:val="222222"/>
+        </w:rPr>
+        <w:t>Maintained native iOS and Android delivery capability while shifting current focus toward Flutter production roles.</w:t>
+      </w:r>
+    </w:p>
+    <w:p>
+      <w:pPr>
+        <w:spacing w:before="85" w:after="30" w:line="276" w:lineRule="auto"/>
+      </w:pPr>
+      <w:r>
+        <w:rPr>
+          <w:rFonts w:ascii="Arial" w:hAnsi="Arial"/>
+          <w:sz w:val="23"/>
+          <w:color w:val="222222"/>
+          <w:b/>
+        </w:rPr>
+        <w:t>Flutter Developer</w:t>
+      </w:r>
+      <w:r>
+        <w:rPr>
+          <w:rFonts w:ascii="Arial" w:hAnsi="Arial"/>
+          <w:sz w:val="22"/>
+          <w:color w:val="222222"/>
+          <w:b/>
+        </w:rPr>
+        <w:t> | Production / Client Projects | 2024 - 2026</w:t>
+      </w:r>
+    </w:p>
+    <w:p>
+      <w:pPr>
+        <w:numPr>
+          <w:ilvl w:val="0"/>
+          <w:numId w:val="1"/>
+        </w:numPr>
+        <w:spacing w:after="48" w:line="276" w:lineRule="auto"/>
+      </w:pPr>
+      <w:r>
+        <w:rPr>
+          <w:rFonts w:ascii="Arial" w:hAnsi="Arial"/>
+          <w:sz w:val="21"/>
+          <w:color w:val="222222"/>
+        </w:rPr>
+        <w:t>Built and contributed to Flutter applications for HRIS, workforce management, government aid workflows, livestock monitoring, and partner operations.</w:t>
+      </w:r>
+    </w:p>
+    <w:p>
+      <w:pPr>
+        <w:numPr>
+          <w:ilvl w:val="0"/>
+          <w:numId w:val="1"/>
+        </w:numPr>
+        <w:spacing w:after="48" w:line="276" w:lineRule="auto"/>
+      </w:pPr>
+      <w:r>
+        <w:rPr>
+          <w:rFonts w:ascii="Arial" w:hAnsi="Arial"/>
+          <w:sz w:val="21"/>
+          <w:color w:val="222222"/>
+        </w:rPr>
+        <w:t>Implemented common production mobile patterns: authenticated API calls, role-based flows, maps/geolocation, liveness/attendance, offline/local cache, push notifications, loading/error states, and multi-flavor environments.</w:t>
+      </w:r>
+    </w:p>
+    <w:p>
+      <w:pPr>
+        <w:numPr>
+          <w:ilvl w:val="0"/>
+          <w:numId w:val="1"/>
+        </w:numPr>
+        <w:spacing w:after="48" w:line="276" w:lineRule="auto"/>
+      </w:pPr>
+      <w:r>
+        <w:rPr>
+          <w:rFonts w:ascii="Arial" w:hAnsi="Arial"/>
+          <w:sz w:val="21"/>
+          <w:color w:val="222222"/>
+        </w:rPr>
+        <w:t>Used Flutter BLoC/Cubit, GoRouter, Dio, GetIt, SharedPreferences, Firebase services, maps packages, WebView, charts, skeleton loading, and debugging tools across real app contexts.</w:t>
+      </w:r>
+    </w:p>
+    <w:p>
+      <w:pPr>
+        <w:pStyle w:val="Heading1"/>
+        <w:spacing w:before="180" w:after="70" w:line="276" w:lineRule="auto"/>
+      </w:pPr>
+      <w:r>
+        <w:rPr>
+          <w:rFonts w:ascii="Arial" w:hAnsi="Arial"/>
+          <w:sz w:val="30"/>
+          <w:color w:val="222222"/>
+          <w:b/>
+        </w:rPr>
         <w:t>SELECTED FLUTTER PROJECTS</w:t>
       </w:r>
     </w:p>
@@ -607,10 +700,10 @@
       <w:r>
         <w:rPr>
           <w:rFonts w:ascii="Arial" w:hAnsi="Arial"/>
-          <w:sz w:val="21"/>
-          <w:color w:val="222222"/>
-        </w:rPr>
-        <w:t>Demonstrates production Flutter delivery across a complex operational domain with authenticated multi-feature workflows and cross-platform mobile ownership.</w:t>
+          <w:sz w:val="20"/>
+          <w:color w:val="222222"/>
+        </w:rPr>
+        <w:t>Relevant to Flutter roles because it shows authenticated multi-feature workflows, operational UX, cross-platform delivery ownership, and product-facing communication in a real business domain.</w:t>
       </w:r>
     </w:p>
     <w:p>
@@ -822,10 +915,10 @@
       <w:r>
         <w:rPr>
           <w:rFonts w:ascii="Arial" w:hAnsi="Arial"/>
-          <w:sz w:val="21"/>
-          <w:color w:val="222222"/>
-        </w:rPr>
-        <w:t>Shows ability to build Flutter apps for field operations where offline-first behavior, maps/location, role-based access, and resilient UX matter.</w:t>
+          <w:sz w:val="20"/>
+          <w:color w:val="222222"/>
+        </w:rPr>
+        <w:t>Relevant to Flutter roles because it combines field operations, offline-friendly behavior, maps/location, role-based access, remote config, push notifications, and resilient UX in a client/government context.</w:t>
       </w:r>
     </w:p>
     <w:p>
@@ -940,10 +1033,10 @@
       <w:r>
         <w:rPr>
           <w:rFonts w:ascii="Arial" w:hAnsi="Arial"/>
-          <w:sz w:val="21"/>
-          <w:color w:val="222222"/>
-        </w:rPr>
-        <w:t>Combines Flutter architecture, Firebase/social login, maps, charts, WebView, permissions, and dev/staging/production flavor discipline in one product domain.</w:t>
+          <w:sz w:val="20"/>
+          <w:color w:val="222222"/>
+        </w:rPr>
+        <w:t>Relevant to Flutter roles because it combines architecture, Firebase/social login, maps, charts, WebView, permissions, local cache, and dev/staging/production flavor discipline in one product domain.</w:t>
       </w:r>
     </w:p>
     <w:p>
@@ -1058,10 +1151,10 @@
       <w:r>
         <w:rPr>
           <w:rFonts w:ascii="Arial" w:hAnsi="Arial"/>
-          <w:sz w:val="21"/>
-          <w:color w:val="222222"/>
-        </w:rPr>
-        <w:t>Acts as a focused portfolio proof for architecture, testability, token/session handling, and the ability to explain engineering decisions beyond UI implementation.</w:t>
+          <w:sz w:val="20"/>
+          <w:color w:val="222222"/>
+        </w:rPr>
+        <w:t>Relevant to Flutter roles because it is public code proof for Clean Architecture, testability, token/session handling, API error handling, and explainable engineering decisions beyond UI implementation.</w:t>
       </w:r>
     </w:p>
     <w:p>
@@ -1174,10 +1267,10 @@
       <w:r>
         <w:rPr>
           <w:rFonts w:ascii="Arial" w:hAnsi="Arial"/>
-          <w:sz w:val="21"/>
-          <w:color w:val="222222"/>
-        </w:rPr>
-        <w:t>Shows native interoperability, serialization across platform channel boundaries, image processing, and Clean Architecture separation.</w:t>
+          <w:sz w:val="20"/>
+          <w:color w:val="222222"/>
+        </w:rPr>
+        <w:t>Relevant to Flutter roles because it demonstrates native interoperability, MethodChannel serialization, image processing, and Clean Architecture boundaries for platform-specific capability.</w:t>
       </w:r>
     </w:p>
     <w:p>
@@ -1275,10 +1368,10 @@
       <w:r>
         <w:rPr>
           <w:rFonts w:ascii="Arial" w:hAnsi="Arial"/>
-          <w:sz w:val="21"/>
-          <w:color w:val="222222"/>
-        </w:rPr>
-        <w:t>Shows performance thinking, native memory boundary awareness, and when FFI is a better fit than MethodChannel.</w:t>
+          <w:sz w:val="20"/>
+          <w:color w:val="222222"/>
+        </w:rPr>
+        <w:t>Relevant to Flutter roles because it demonstrates performance thinking, native memory boundary awareness, isolate usage, and when Dart FFI is a better fit than MethodChannel.</w:t>
       </w:r>
     </w:p>
     <w:p>
@@ -1376,10 +1469,10 @@
       <w:r>
         <w:rPr>
           <w:rFonts w:ascii="Arial" w:hAnsi="Arial"/>
-          <w:sz w:val="21"/>
-          <w:color w:val="222222"/>
-        </w:rPr>
-        <w:t>Shows rendering pipeline awareness, polished UI engineering, animation, and reusable widget API design.</w:t>
+          <w:sz w:val="20"/>
+          <w:color w:val="222222"/>
+        </w:rPr>
+        <w:t>Relevant to Flutter roles because it demonstrates rendering pipeline awareness, polished UI engineering, animation, haptics, and reusable widget API design.</w:t>
       </w:r>
     </w:p>
     <w:p>
@@ -1477,10 +1570,10 @@
       <w:r>
         <w:rPr>
           <w:rFonts w:ascii="Arial" w:hAnsi="Arial"/>
-          <w:sz w:val="21"/>
-          <w:color w:val="222222"/>
-        </w:rPr>
-        <w:t>Shows platform-level mobile depth useful for Flutter projects that need native Android modules.</w:t>
+          <w:sz w:val="20"/>
+          <w:color w:val="222222"/>
+        </w:rPr>
+        <w:t>Relevant to Flutter roles because it demonstrates native Android depth useful for Flutter apps that need SDK modules, CameraX, ML Kit, Gradle distribution, and platform-specific debugging.</w:t>
       </w:r>
     </w:p>
     <w:p>

</xml_diff>

<commit_message>
Add AI automation project to Flutter CV
</commit_message>
<xml_diff>
--- a/CV/CV_RizkaFajarNugraha_FlutterDeveloper_2026.docx
+++ b/CV/CV_RizkaFajarNugraha_FlutterDeveloper_2026.docx
@@ -1672,6 +1672,81 @@
         </w:rPr>
         <w:t>SUPPORTING FULL-STACK / TOOLING RANGE</w:t>
       </w:r>
+    </w:p>
+    <w:p>
+      <w:pPr>
+        <w:numPr>
+          <w:ilvl w:val="0"/>
+          <w:numId w:val="1"/>
+        </w:numPr>
+        <w:spacing w:after="48" w:line="276" w:lineRule="auto"/>
+      </w:pPr>
+      <w:r>
+        <w:rPr>
+          <w:rFonts w:ascii="Arial" w:hAnsi="Arial"/>
+          <w:sz w:val="22"/>
+          <w:color w:val="222222"/>
+          <w:b/>
+        </w:rPr>
+        <w:t xml:space="preserve">Company Detector Bot: </w:t>
+      </w:r>
+      <w:r>
+        <w:rPr>
+          <w:rFonts w:ascii="Arial" w:hAnsi="Arial"/>
+          <w:sz w:val="22"/>
+          <w:color w:val="222222"/>
+        </w:rPr>
+        <w:t xml:space="preserve">live AI automation system used in company operations to detect business/company register accounts from limited signup data; built as a hybrid Go + OpenClaw AI pipeline with PostgreSQL evidence storage, dashboard review, webhook queue, sequential worker, Telegram delivery, Slack daily prospect digest, and VPS deployment. Links: </w:t>
+      </w:r>
+      <w:hyperlink r:id="rId23" w:history="1">
+        <w:r>
+          <w:rPr>
+            <w:rFonts w:ascii="Arial" w:hAnsi="Arial"/>
+            <w:sz w:val="22"/>
+            <w:color w:val="1155CC"/>
+            <w:u w:val="single"/>
+          </w:rPr>
+          <w:t>[Case Study]</w:t>
+        </w:r>
+      </w:hyperlink>
+      <w:r>
+        <w:rPr>
+          <w:rFonts w:ascii="Arial" w:hAnsi="Arial"/>
+          <w:sz w:val="22"/>
+          <w:color w:val="222222"/>
+        </w:rPr>
+        <w:t xml:space="preserve"> | </w:t>
+      </w:r>
+      <w:hyperlink r:id="rId24" w:history="1">
+        <w:r>
+          <w:rPr>
+            <w:rFonts w:ascii="Arial" w:hAnsi="Arial"/>
+            <w:sz w:val="22"/>
+            <w:color w:val="1155CC"/>
+            <w:u w:val="single"/>
+          </w:rPr>
+          <w:t>[GitHub Repository]</w:t>
+        </w:r>
+      </w:hyperlink>
+      <w:r>
+        <w:rPr>
+          <w:rFonts w:ascii="Arial" w:hAnsi="Arial"/>
+          <w:sz w:val="22"/>
+          <w:color w:val="222222"/>
+        </w:rPr>
+        <w:t xml:space="preserve"> | </w:t>
+      </w:r>
+      <w:hyperlink r:id="rId25" w:history="1">
+        <w:r>
+          <w:rPr>
+            <w:rFonts w:ascii="Arial" w:hAnsi="Arial"/>
+            <w:sz w:val="22"/>
+            <w:color w:val="1155CC"/>
+            <w:u w:val="single"/>
+          </w:rPr>
+          <w:t>[Live Demo]</w:t>
+        </w:r>
+      </w:hyperlink>
     </w:p>
     <w:p>
       <w:pPr>

</xml_diff>